<commit_message>
Quyển 8: chương 141–144; sửa xưng hô Thái tử phi ở ch.140, xuất lại docx Q7 cụm 4
Co-Authored-By: Claude Opus 5.5 <noreply@anthropic.com>
Claude-Session: https://claude.ai/code/session_017NVvU8PoaDTWRzmHCSXNth
</commit_message>
<xml_diff>
--- a/docx/ThuongNguyen_Q7_Cum4_Ch136-140.docx
+++ b/docx/ThuongNguyen_Q7_Cum4_Ch136-140.docx
@@ -14869,7 +14869,7 @@
           <w:iCs w:val="false"/>
           <w:strike w:val="false"/>
         </w:rPr>
-        <w:t xml:space="preserve">"Thư nhà," Tố Y nói. Giọng nàng ấy nhẹ. Không lên không xuống. "Phụ thân thần nữ viết. Mười hai tháng Ba. Một dòng."</w:t>
+        <w:t xml:space="preserve">"Thư nhà," Tố Y nói. Giọng nàng ấy nhẹ. Không lên không xuống. "Phụ thân thần thiếp viết. Mười hai tháng Ba. Một dòng."</w:t>
       </w:r>
     </w:p>
     <w:p>
@@ -14923,7 +14923,7 @@
           <w:iCs w:val="false"/>
           <w:strike w:val="false"/>
         </w:rPr>
-        <w:t xml:space="preserve">"Thần nữ đã xin mẫu hậu một lần," Tố Y nói. "Năm kia. </w:t>
+        <w:t xml:space="preserve">"Thần thiếp đã xin mẫu hậu một lần," Tố Y nói. "Năm kia. Khi còn là thần nữ. </w:t>
       </w:r>
       <w:r>
         <w:rPr>
@@ -14969,7 +14969,7 @@
           <w:iCs w:val="false"/>
           <w:strike w:val="false"/>
         </w:rPr>
-        <w:t xml:space="preserve">"Điện hạ viết bốn mươi bảy tờ. Có tên nhà thần nữ. Phụ thân thần nữ đọc chín tờ."</w:t>
+        <w:t xml:space="preserve">"Điện hạ viết bốn mươi bảy tờ. Có tên nhà thần thiếp. Phụ thân thần thiếp đọc chín tờ."</w:t>
       </w:r>
     </w:p>
     <w:p>
@@ -14999,7 +14999,7 @@
           <w:iCs w:val="false"/>
           <w:strike w:val="false"/>
         </w:rPr>
-        <w:t xml:space="preserve">"Thần nữ xin đọc bốn mươi bảy."</w:t>
+        <w:t xml:space="preserve">"Thần thiếp xin đọc bốn mươi bảy."</w:t>
       </w:r>
     </w:p>
     <w:p>

</xml_diff>